<commit_message>
Публикация прототипа из Flumos1/MLO@d291be65427ef3f9b9035bbc6067f4325b0a1aa3
</commit_message>
<xml_diff>
--- a/docs/01_Methodology_EN.docx
+++ b/docs/01_Methodology_EN.docx
@@ -874,7 +874,7 @@
           </w:pPr>
           <w:hyperlink w:history="1" w:anchor="_Toc34">
             <w:r>
-              <w:t xml:space="preserve">U3. Benchmark combat units (CPU)</w:t>
+              <w:t xml:space="preserve">U3. Benchmark combat units (CP)</w:t>
             </w:r>
             <w:r>
               <w:tab/>
@@ -5866,7 +5866,7 @@
         <w:t xml:space="preserve">What we borrow.</w:t>
       </w:r>
       <w:r>
-        <w:t xml:space="preserve"> Benchmark combat units (CPU) and commensurability coefficients. We supplement them with an annual review of the reference and non-linear aggregation.</w:t>
+        <w:t xml:space="preserve"> Benchmark combat units (CP) and commensurability coefficients. We supplement them with an annual review of the reference and non-linear aggregation.</w:t>
       </w:r>
     </w:p>
     <w:p>
@@ -11415,7 +11415,7 @@
       </w:pPr>
       <w:bookmarkStart w:name="_Toc34" w:id="34"/>
       <w:r>
-        <w:t xml:space="preserve">U3. Benchmark combat units (CPU)</w:t>
+        <w:t xml:space="preserve">U3. Benchmark combat units (CP)</w:t>
       </w:r>
       <w:bookmarkEnd w:id="34"/>
     </w:p>
@@ -12006,7 +12006,7 @@
           <w:sz w:val="19"/>
           <w:szCs w:val="19"/>
         </w:rPr>
-        <w:t xml:space="preserve">3. CPU:              N_eff = Σ nₖ·qₖ·rₖ;   q — AHP + potential–antipotential</w:t>
+        <w:t xml:space="preserve">3. CP:              N_eff = Σ nₖ·qₖ·rₖ;   q — AHP + potential–antipotential</w:t>
       </w:r>
     </w:p>
     <w:p>

</xml_diff>